<commit_message>
Revise the Merz worksheet: shorter rules and plainer wording
The fill-in rules ran about 7.3 inches against 6.9 inches of usable page
width, so every one of them wrapped onto a second line. They are now 78
and 74 characters instead of 95 and 88, which fits.

The wording is warmer and drops the jargon. Question 3 no longer calls the
final sentence a "warrant"; it says that is where the real work happens and
that the essay will ask the same thing. Question 4 no longer reads as a
correction, and question 1 states the citation test as something to check
rather than a rule that has been broken.

Co-Authored-By: Claude Opus 5 <noreply@anthropic.com>
Claude-Session: https://claude.ai/code/session_01TJPtxSRYdaC2iDe48kC8Dk
</commit_message>
<xml_diff>
--- a/files/CIE100-Merz-Visual-Response-Worksheet.docx
+++ b/files/CIE100-Merz-Visual-Response-Worksheet.docx
@@ -37,7 +37,7 @@
           <w:i w:val="0"/>
           <w:sz w:val="22"/>
         </w:rPr>
-        <w:t>Name: ______________________________     Partner: ______________________________</w:t>
+        <w:t>Name: ____________________________     Partner: ____________________________</w:t>
       </w:r>
     </w:p>
     <w:p>
@@ -50,7 +50,7 @@
           <w:i/>
           <w:sz w:val="22"/>
         </w:rPr>
-        <w:t>Work through these in order. Do not skip ahead to question 3. The order is the point: describe before you interpret.</w:t>
+        <w:t>Take these in order, and resist the urge to jump ahead to question 3. Looking first and deciding what it means second is the whole point, and it is harder than it sounds.</w:t>
       </w:r>
     </w:p>
     <w:p>
@@ -76,7 +76,7 @@
           <w:i w:val="0"/>
           <w:sz w:val="20"/>
         </w:rPr>
-        <w:t>List five things you can actually see. Locate each one the way you would cite a passage: "in the lower left, a ___". If someone cannot walk to the wall and put a finger on the thing you described, you have not cited it.</w:t>
+        <w:t>Name five things you can actually see. Say where each one is, the way you would give a page number: "in the lower left, a ___". A good test is whether someone could walk up to the wall and put a finger on what you described.</w:t>
       </w:r>
     </w:p>
     <w:p>
@@ -87,7 +87,7 @@
         <w:rPr>
           <w:sz w:val="22"/>
         </w:rPr>
-        <w:t>1.  ________________________________________________________________________________________</w:t>
+        <w:t>1.  __________________________________________________________________________</w:t>
       </w:r>
     </w:p>
     <w:p>
@@ -98,7 +98,7 @@
         <w:rPr>
           <w:sz w:val="22"/>
         </w:rPr>
-        <w:t>2.  ________________________________________________________________________________________</w:t>
+        <w:t>2.  __________________________________________________________________________</w:t>
       </w:r>
     </w:p>
     <w:p>
@@ -109,7 +109,7 @@
         <w:rPr>
           <w:sz w:val="22"/>
         </w:rPr>
-        <w:t>3.  ________________________________________________________________________________________</w:t>
+        <w:t>3.  __________________________________________________________________________</w:t>
       </w:r>
     </w:p>
     <w:p>
@@ -120,7 +120,7 @@
         <w:rPr>
           <w:sz w:val="22"/>
         </w:rPr>
-        <w:t>4.  ________________________________________________________________________________________</w:t>
+        <w:t>4.  __________________________________________________________________________</w:t>
       </w:r>
     </w:p>
     <w:p>
@@ -131,7 +131,7 @@
         <w:rPr>
           <w:sz w:val="22"/>
         </w:rPr>
-        <w:t>5.  ________________________________________________________________________________________</w:t>
+        <w:t>5.  __________________________________________________________________________</w:t>
       </w:r>
     </w:p>
     <w:p>
@@ -162,7 +162,7 @@
           <w:i w:val="0"/>
           <w:sz w:val="20"/>
         </w:rPr>
-        <w:t>Line weight, scale, repetition, what is crowded and what is given room, what sits at eye level and what is far above it.</w:t>
+        <w:t>Think about line weight, scale, what repeats, what is crowded and what is given room, and what sits at eye level versus far above it.</w:t>
       </w:r>
     </w:p>
     <w:p>
@@ -173,7 +173,7 @@
         <w:rPr>
           <w:sz w:val="22"/>
         </w:rPr>
-        <w:t>_______________________________________________________________________________________________</w:t>
+        <w:t>______________________________________________________________________________</w:t>
       </w:r>
     </w:p>
     <w:p>
@@ -184,7 +184,7 @@
         <w:rPr>
           <w:sz w:val="22"/>
         </w:rPr>
-        <w:t>_______________________________________________________________________________________________</w:t>
+        <w:t>______________________________________________________________________________</w:t>
       </w:r>
     </w:p>
     <w:p>
@@ -195,7 +195,7 @@
         <w:rPr>
           <w:sz w:val="22"/>
         </w:rPr>
-        <w:t>_______________________________________________________________________________________________</w:t>
+        <w:t>______________________________________________________________________________</w:t>
       </w:r>
     </w:p>
     <w:p>
@@ -221,7 +221,7 @@
           <w:i w:val="0"/>
           <w:sz w:val="20"/>
         </w:rPr>
-        <w:t>Choose ONE glyph from question 1. Give two different readings of it. Then say, in one sentence, why the thing you described in question 1 supports the reading you prefer.</w:t>
+        <w:t>Pick one glyph from question 1 and give two different readings of it. Then, in one sentence, say why the thing you described up in question 1 points toward the reading you like better.</w:t>
       </w:r>
     </w:p>
     <w:p>
@@ -234,7 +234,7 @@
           <w:i/>
           <w:sz w:val="20"/>
         </w:rPr>
-        <w:t>That last sentence is the warrant. It is the move your essay needs.</w:t>
+        <w:t>That last sentence is where the real work happens, and it is the same move your essay will ask of you. Better to practice it here, standing at a wall, than at midnight in a draft.</w:t>
       </w:r>
     </w:p>
     <w:p>
@@ -245,7 +245,7 @@
         <w:rPr>
           <w:sz w:val="22"/>
         </w:rPr>
-        <w:t>Glyph:  ______________________________________________________________________________________</w:t>
+        <w:t>Glyph:  ______________________________________________________________________</w:t>
       </w:r>
     </w:p>
     <w:p>
@@ -256,7 +256,7 @@
         <w:rPr>
           <w:sz w:val="22"/>
         </w:rPr>
-        <w:t>Reading A:  __________________________________________________________________________________</w:t>
+        <w:t>Reading A:  __________________________________________________________________</w:t>
       </w:r>
     </w:p>
     <w:p>
@@ -267,7 +267,7 @@
         <w:rPr>
           <w:sz w:val="22"/>
         </w:rPr>
-        <w:t>Reading B:  __________________________________________________________________________________</w:t>
+        <w:t>Reading B:  __________________________________________________________________</w:t>
       </w:r>
     </w:p>
     <w:p>
@@ -280,7 +280,7 @@
           <w:i w:val="0"/>
           <w:sz w:val="20"/>
         </w:rPr>
-        <w:t>Why my description supports my preferred reading:</w:t>
+        <w:t>Why what I described points toward the reading I prefer:</w:t>
       </w:r>
     </w:p>
     <w:p>
@@ -291,7 +291,7 @@
         <w:rPr>
           <w:sz w:val="22"/>
         </w:rPr>
-        <w:t>_______________________________________________________________________________________________</w:t>
+        <w:t>______________________________________________________________________________</w:t>
       </w:r>
     </w:p>
     <w:p>
@@ -302,7 +302,7 @@
         <w:rPr>
           <w:sz w:val="22"/>
         </w:rPr>
-        <w:t>_______________________________________________________________________________________________</w:t>
+        <w:t>______________________________________________________________________________</w:t>
       </w:r>
     </w:p>
     <w:p>
@@ -328,7 +328,7 @@
           <w:i w:val="0"/>
           <w:sz w:val="20"/>
         </w:rPr>
-        <w:t>Write an actual question, ending in a question mark. Not what the wall says. What it asks.</w:t>
+        <w:t>Write a real question, ending in a question mark. We are not after what the wall tells you. We are after what it asks you.</w:t>
       </w:r>
     </w:p>
     <w:p>
@@ -339,7 +339,7 @@
         <w:rPr>
           <w:sz w:val="22"/>
         </w:rPr>
-        <w:t>_______________________________________________________________________________________________</w:t>
+        <w:t>______________________________________________________________________________</w:t>
       </w:r>
     </w:p>
     <w:p>
@@ -350,7 +350,7 @@
         <w:rPr>
           <w:sz w:val="22"/>
         </w:rPr>
-        <w:t>_______________________________________________________________________________________________</w:t>
+        <w:t>______________________________________________________________________________</w:t>
       </w:r>
     </w:p>
     <w:p>
@@ -376,7 +376,7 @@
           <w:i w:val="0"/>
           <w:sz w:val="20"/>
         </w:rPr>
-        <w:t>Which of the four Core Questions does your question sit closest to?</w:t>
+        <w:t>Which of our four Core Questions does your question sit closest to?</w:t>
       </w:r>
     </w:p>
     <w:p>
@@ -389,7 +389,7 @@
           <w:i/>
           <w:sz w:val="20"/>
         </w:rPr>
-        <w:t>What should matter to me?   ·   How should we live together?   ·   How can we understand the world?   ·   What will I do?</w:t>
+        <w:t>What should matter to me?  ·  How should we live together?  ·  How can we understand the world?  ·  What will I do?</w:t>
       </w:r>
     </w:p>
     <w:p>
@@ -400,7 +400,7 @@
         <w:rPr>
           <w:sz w:val="22"/>
         </w:rPr>
-        <w:t>_______________________________________________________________________________________________</w:t>
+        <w:t>______________________________________________________________________________</w:t>
       </w:r>
     </w:p>
     <w:sectPr>

</xml_diff>

<commit_message>
Trim an aside from the Merz worksheet
Removes the italic line under question 3 about where the real work happens
and practicing at the wall rather than at midnight. The question already
tells students what to write, and the aside editorialized about the essay
instead of helping them look at the wall.

Nothing else changes.

Co-Authored-By: Claude Opus 5 <noreply@anthropic.com>
Claude-Session: https://claude.ai/code/session_01TJPtxSRYdaC2iDe48kC8Dk
</commit_message>
<xml_diff>
--- a/files/CIE100-Merz-Visual-Response-Worksheet.docx
+++ b/files/CIE100-Merz-Visual-Response-Worksheet.docx
@@ -213,7 +213,7 @@
     </w:p>
     <w:p>
       <w:pPr>
-        <w:spacing w:after="80"/>
+        <w:spacing w:after="160"/>
       </w:pPr>
       <w:r>
         <w:rPr>
@@ -222,19 +222,6 @@
           <w:sz w:val="20"/>
         </w:rPr>
         <w:t>Pick one glyph from question 1 and give two different readings of it. Then, in one sentence, say why the thing you described up in question 1 points toward the reading you like better.</w:t>
-      </w:r>
-    </w:p>
-    <w:p>
-      <w:pPr>
-        <w:spacing w:after="160"/>
-      </w:pPr>
-      <w:r>
-        <w:rPr>
-          <w:b w:val="0"/>
-          <w:i/>
-          <w:sz w:val="20"/>
-        </w:rPr>
-        <w:t>That last sentence is where the real work happens, and it is the same move your essay will ask of you. Better to practice it here, standing at a wall, than at midnight in a draft.</w:t>
       </w:r>
     </w:p>
     <w:p>

</xml_diff>